<commit_message>
ajout du déroulement  des tours
</commit_message>
<xml_diff>
--- a/Analyse de besoins.docx
+++ b/Analyse de besoins.docx
@@ -51,435 +51,26 @@
     <w:p>
       <w:pPr>
         <w:rPr>
-          <w:lang w:val="fr-FR"/>
-        </w:rPr>
-      </w:pPr>
-    </w:p>
-    <w:p>
-      <w:pPr>
-        <w:jc w:val="both"/>
-        <w:rPr>
-          <w:b/>
-          <w:bCs/>
+          <w:b/>
+          <w:bCs/>
+          <w:i/>
+          <w:iCs/>
           <w:sz w:val="28"/>
           <w:szCs w:val="28"/>
           <w:lang w:val="fr-FR"/>
         </w:rPr>
       </w:pPr>
-      <w:r>
+    </w:p>
+    <w:p>
+      <w:pPr>
         <w:rPr>
           <w:b/>
           <w:bCs/>
           <w:sz w:val="28"/>
           <w:szCs w:val="28"/>
-          <w:lang w:val="fr-FR"/>
-        </w:rPr>
-        <w:t>Besoins Fonctionnels</w:t>
-      </w:r>
-    </w:p>
-    <w:p>
-      <w:pPr>
-        <w:rPr>
-          <w:b/>
-          <w:bCs/>
-          <w:lang w:val="fr-FR"/>
-        </w:rPr>
-      </w:pPr>
-    </w:p>
-    <w:p>
-      <w:pPr>
-        <w:rPr>
-          <w:b/>
-          <w:bCs/>
-          <w:lang w:val="fr-FR"/>
-        </w:rPr>
-      </w:pPr>
-      <w:r>
-        <w:rPr>
-          <w:b/>
-          <w:bCs/>
-          <w:lang w:val="fr-FR"/>
-        </w:rPr>
-        <w:t>ClueLau demande un jeu d'enquête type Cluedo</w:t>
-      </w:r>
-      <w:r>
-        <w:rPr>
-          <w:b/>
-          <w:bCs/>
-          <w:lang w:val="fr-FR"/>
-        </w:rPr>
-        <w:t xml:space="preserve"> (enquête).</w:t>
-      </w:r>
-    </w:p>
-    <w:p>
-      <w:pPr>
-        <w:rPr>
-          <w:lang w:val="fr-FR"/>
-        </w:rPr>
-      </w:pPr>
-      <w:r>
-        <w:rPr>
-          <w:lang w:val="fr-FR"/>
-        </w:rPr>
-        <w:t xml:space="preserve">- </w:t>
-      </w:r>
-      <w:r>
-        <w:rPr>
-          <w:lang w:val="fr-FR"/>
-        </w:rPr>
-        <w:t>Le jeu se joue d</w:t>
-      </w:r>
-      <w:r>
-        <w:rPr>
-          <w:lang w:val="fr-FR"/>
-        </w:rPr>
-        <w:t xml:space="preserve">ans le </w:t>
-      </w:r>
-      <w:r>
-        <w:rPr>
-          <w:b/>
-          <w:bCs/>
-          <w:lang w:val="fr-FR"/>
-        </w:rPr>
-        <w:t>terminal</w:t>
-      </w:r>
-    </w:p>
-    <w:p>
-      <w:pPr>
-        <w:rPr>
-          <w:lang w:val="fr-FR"/>
-        </w:rPr>
-      </w:pPr>
-      <w:r>
-        <w:rPr>
-          <w:lang w:val="fr-FR"/>
-        </w:rPr>
-        <w:t xml:space="preserve">- </w:t>
-      </w:r>
-      <w:r>
-        <w:rPr>
-          <w:lang w:val="fr-FR"/>
-        </w:rPr>
-        <w:t>M</w:t>
-      </w:r>
-      <w:r>
-        <w:rPr>
-          <w:lang w:val="fr-FR"/>
-        </w:rPr>
-        <w:t xml:space="preserve">écanique de </w:t>
-      </w:r>
-      <w:r>
-        <w:rPr>
-          <w:b/>
-          <w:bCs/>
-          <w:lang w:val="fr-FR"/>
-        </w:rPr>
-        <w:t>déduction</w:t>
-      </w:r>
-      <w:r>
-        <w:rPr>
-          <w:lang w:val="fr-FR"/>
-        </w:rPr>
-        <w:t xml:space="preserve"> (par preuves / détails)</w:t>
-      </w:r>
-    </w:p>
-    <w:p>
-      <w:pPr>
-        <w:rPr>
-          <w:lang w:val="fr-FR"/>
-        </w:rPr>
-      </w:pPr>
-      <w:r>
-        <w:rPr>
-          <w:lang w:val="fr-FR"/>
-        </w:rPr>
-        <w:t xml:space="preserve">- </w:t>
-      </w:r>
-      <w:r>
-        <w:rPr>
-          <w:lang w:val="fr-FR"/>
-        </w:rPr>
-        <w:t>C</w:t>
-      </w:r>
-      <w:r>
-        <w:rPr>
-          <w:lang w:val="fr-FR"/>
-        </w:rPr>
-        <w:t xml:space="preserve">ombinaison </w:t>
-      </w:r>
-      <w:r>
-        <w:rPr>
-          <w:b/>
-          <w:bCs/>
-          <w:lang w:val="fr-FR"/>
-        </w:rPr>
-        <w:t>S</w:t>
-      </w:r>
-      <w:r>
-        <w:rPr>
-          <w:b/>
-          <w:bCs/>
-          <w:lang w:val="fr-FR"/>
-        </w:rPr>
-        <w:t>ecrète</w:t>
-      </w:r>
-    </w:p>
-    <w:p>
-      <w:pPr>
-        <w:rPr>
-          <w:lang w:val="fr-FR"/>
-        </w:rPr>
-      </w:pPr>
-      <w:r>
-        <w:rPr>
-          <w:lang w:val="fr-FR"/>
-        </w:rPr>
-        <w:t xml:space="preserve">- </w:t>
-      </w:r>
-      <w:r>
-        <w:rPr>
-          <w:b/>
-          <w:bCs/>
-          <w:lang w:val="fr-FR"/>
-        </w:rPr>
-        <w:t>Plusieurs joueurs</w:t>
-      </w:r>
-      <w:r>
-        <w:rPr>
-          <w:lang w:val="fr-FR"/>
-        </w:rPr>
-        <w:t xml:space="preserve"> peuvent participer</w:t>
-      </w:r>
-    </w:p>
-    <w:p>
-      <w:pPr>
-        <w:rPr>
-          <w:lang w:val="fr-FR"/>
-        </w:rPr>
-      </w:pPr>
-      <w:r>
-        <w:rPr>
-          <w:lang w:val="fr-FR"/>
-        </w:rPr>
-        <w:t xml:space="preserve">- joueurs humains </w:t>
-      </w:r>
-      <w:r>
-        <w:rPr>
-          <w:b/>
-          <w:bCs/>
-          <w:lang w:val="fr-FR"/>
-        </w:rPr>
-        <w:t>et</w:t>
-      </w:r>
-      <w:r>
-        <w:rPr>
-          <w:lang w:val="fr-FR"/>
-        </w:rPr>
-        <w:t xml:space="preserve"> ordinateurs</w:t>
-      </w:r>
-    </w:p>
-    <w:p>
-      <w:pPr>
-        <w:rPr>
-          <w:lang w:val="fr-FR"/>
-        </w:rPr>
-      </w:pPr>
-      <w:r>
-        <w:rPr>
-          <w:lang w:val="fr-FR"/>
-        </w:rPr>
-        <w:t xml:space="preserve">- </w:t>
-      </w:r>
-      <w:r>
-        <w:rPr>
-          <w:b/>
-          <w:bCs/>
-          <w:lang w:val="fr-FR"/>
-        </w:rPr>
-        <w:t>deux comportements</w:t>
-      </w:r>
-      <w:r>
-        <w:rPr>
-          <w:lang w:val="fr-FR"/>
-        </w:rPr>
-        <w:t xml:space="preserve"> d'intelligence artificielle :</w:t>
-      </w:r>
-    </w:p>
-    <w:p>
-      <w:pPr>
-        <w:rPr>
-          <w:lang w:val="fr-FR"/>
-        </w:rPr>
-      </w:pPr>
-      <w:r>
-        <w:rPr>
-          <w:lang w:val="fr-FR"/>
-        </w:rPr>
-        <w:t xml:space="preserve">    -&gt; 1 comportement </w:t>
-      </w:r>
-      <w:r>
-        <w:rPr>
-          <w:b/>
-          <w:bCs/>
-          <w:lang w:val="fr-FR"/>
-        </w:rPr>
-        <w:t>naïf</w:t>
-      </w:r>
-      <w:r>
-        <w:rPr>
-          <w:lang w:val="fr-FR"/>
-        </w:rPr>
-        <w:t xml:space="preserve">, </w:t>
-      </w:r>
-      <w:r>
-        <w:rPr>
-          <w:b/>
-          <w:bCs/>
-          <w:lang w:val="fr-FR"/>
-        </w:rPr>
-        <w:t>simple</w:t>
-      </w:r>
-    </w:p>
-    <w:p>
-      <w:pPr>
-        <w:rPr>
-          <w:lang w:val="fr-FR"/>
-        </w:rPr>
-      </w:pPr>
-      <w:r>
-        <w:rPr>
-          <w:lang w:val="fr-FR"/>
-        </w:rPr>
-        <w:t xml:space="preserve">    -&gt; 1 comportement </w:t>
-      </w:r>
-      <w:r>
-        <w:rPr>
-          <w:b/>
-          <w:bCs/>
-          <w:lang w:val="fr-FR"/>
-        </w:rPr>
-        <w:t>plus évolué</w:t>
-      </w:r>
-      <w:r>
-        <w:rPr>
-          <w:lang w:val="fr-FR"/>
-        </w:rPr>
-        <w:t>, capable de tenir compte de ce qui s'est passé pendant la partie (</w:t>
-      </w:r>
-      <w:r>
-        <w:rPr>
-          <w:b/>
-          <w:bCs/>
-          <w:lang w:val="fr-FR"/>
-        </w:rPr>
-        <w:t>mémorise</w:t>
-      </w:r>
-      <w:r>
-        <w:rPr>
-          <w:lang w:val="fr-FR"/>
-        </w:rPr>
-        <w:t xml:space="preserve"> les infos utiles et adopte une stratégie </w:t>
-      </w:r>
-      <w:r>
-        <w:rPr>
-          <w:b/>
-          <w:bCs/>
-          <w:lang w:val="fr-FR"/>
-        </w:rPr>
-        <w:t>subtile</w:t>
-      </w:r>
-      <w:r>
-        <w:rPr>
-          <w:lang w:val="fr-FR"/>
-        </w:rPr>
-        <w:t xml:space="preserve"> ou m</w:t>
-      </w:r>
-      <w:r>
-        <w:rPr>
-          <w:lang w:val="fr-FR"/>
-        </w:rPr>
-        <w:t>ême</w:t>
-      </w:r>
-      <w:r>
-        <w:rPr>
-          <w:lang w:val="fr-FR"/>
-        </w:rPr>
-        <w:t xml:space="preserve"> </w:t>
-      </w:r>
-      <w:r>
-        <w:rPr>
-          <w:b/>
-          <w:bCs/>
-          <w:lang w:val="fr-FR"/>
-        </w:rPr>
-        <w:t>trompeuse</w:t>
-      </w:r>
-      <w:r>
-        <w:rPr>
-          <w:lang w:val="fr-FR"/>
-        </w:rPr>
-        <w:t>)</w:t>
-      </w:r>
-    </w:p>
-    <w:p>
-      <w:pPr>
-        <w:rPr>
-          <w:b/>
-          <w:bCs/>
-          <w:lang w:val="fr-FR"/>
-        </w:rPr>
-      </w:pPr>
-      <w:r>
-        <w:rPr>
-          <w:lang w:val="fr-FR"/>
-        </w:rPr>
-        <w:t xml:space="preserve">- codé en </w:t>
-      </w:r>
-      <w:r>
-        <w:rPr>
-          <w:b/>
-          <w:bCs/>
-          <w:lang w:val="fr-FR"/>
-        </w:rPr>
-        <w:t>c</w:t>
-      </w:r>
-    </w:p>
-    <w:p>
-      <w:pPr>
-        <w:rPr>
-          <w:lang w:val="fr-FR"/>
-        </w:rPr>
-      </w:pPr>
-      <w:r>
-        <w:rPr>
-          <w:lang w:val="fr-FR"/>
-        </w:rPr>
-        <w:t xml:space="preserve">- </w:t>
-      </w:r>
-      <w:r>
-        <w:rPr>
-          <w:lang w:val="fr-FR"/>
-        </w:rPr>
-        <w:t xml:space="preserve">application </w:t>
-      </w:r>
-      <w:r>
-        <w:rPr>
-          <w:b/>
-          <w:bCs/>
-          <w:lang w:val="fr-FR"/>
-        </w:rPr>
-        <w:t>fonctionnelle</w:t>
-      </w:r>
-    </w:p>
-    <w:p>
-      <w:pPr>
-        <w:rPr>
-          <w:lang w:val="fr-FR"/>
-        </w:rPr>
-      </w:pPr>
-    </w:p>
-    <w:p>
-      <w:pPr>
+        </w:rPr>
+      </w:pPr>
+      <w:r>
         <w:rPr>
           <w:b/>
           <w:bCs/>
@@ -487,15 +78,595 @@
           <w:szCs w:val="28"/>
           <w:lang w:val="fr-FR"/>
         </w:rPr>
-      </w:pPr>
+        <w:t xml:space="preserve">Déroulement du jeu </w:t>
+      </w:r>
       <w:r>
         <w:rPr>
           <w:b/>
           <w:bCs/>
           <w:sz w:val="28"/>
           <w:szCs w:val="28"/>
-          <w:lang w:val="fr-FR"/>
-        </w:rPr>
+        </w:rPr>
+        <w:t>:</w:t>
+      </w:r>
+    </w:p>
+    <w:p>
+      <w:pPr>
+        <w:rPr>
+          <w:sz w:val="22"/>
+          <w:szCs w:val="22"/>
+          <w:lang w:val="fr-FR"/>
+        </w:rPr>
+      </w:pPr>
+      <w:r>
+        <w:rPr>
+          <w:sz w:val="22"/>
+          <w:szCs w:val="22"/>
+          <w:lang w:val="fr-FR"/>
+        </w:rPr>
+        <w:t xml:space="preserve">Au début de la partie le menu permettra de rajouter un vrai joueur ou un ordi (au choix) jusqu’à ce que </w:t>
+      </w:r>
+      <w:r>
+        <w:rPr>
+          <w:sz w:val="22"/>
+          <w:szCs w:val="22"/>
+          <w:lang w:val="fr-FR"/>
+        </w:rPr>
+        <w:t xml:space="preserve">tout le monde </w:t>
+      </w:r>
+      <w:proofErr w:type="gramStart"/>
+      <w:r>
+        <w:rPr>
+          <w:sz w:val="22"/>
+          <w:szCs w:val="22"/>
+          <w:lang w:val="fr-FR"/>
+        </w:rPr>
+        <w:t>est</w:t>
+      </w:r>
+      <w:proofErr w:type="gramEnd"/>
+      <w:r>
+        <w:rPr>
+          <w:sz w:val="22"/>
+          <w:szCs w:val="22"/>
+          <w:lang w:val="fr-FR"/>
+        </w:rPr>
+        <w:t xml:space="preserve"> rajouté.</w:t>
+      </w:r>
+    </w:p>
+    <w:p>
+      <w:pPr>
+        <w:rPr>
+          <w:sz w:val="22"/>
+          <w:szCs w:val="22"/>
+          <w:lang w:val="fr-FR"/>
+        </w:rPr>
+      </w:pPr>
+      <w:r>
+        <w:rPr>
+          <w:sz w:val="22"/>
+          <w:szCs w:val="22"/>
+          <w:lang w:val="fr-FR"/>
+        </w:rPr>
+        <w:t>Le jeu choisit un personnage une arme et un lieu au hasard mais ne les montre pas</w:t>
+      </w:r>
+    </w:p>
+    <w:p>
+      <w:pPr>
+        <w:rPr>
+          <w:sz w:val="22"/>
+          <w:szCs w:val="22"/>
+          <w:lang w:val="fr-FR"/>
+        </w:rPr>
+      </w:pPr>
+      <w:r>
+        <w:rPr>
+          <w:sz w:val="22"/>
+          <w:szCs w:val="22"/>
+          <w:lang w:val="fr-FR"/>
+        </w:rPr>
+        <w:t>Chaque tour le joueur a le choix entre se déplacer dans une autre pièce ou interagir avec l’environnement (qui lui sera pr</w:t>
+      </w:r>
+      <w:r>
+        <w:rPr>
+          <w:sz w:val="22"/>
+          <w:szCs w:val="22"/>
+          <w:lang w:val="fr-FR"/>
+        </w:rPr>
+        <w:t>é</w:t>
+      </w:r>
+      <w:r>
+        <w:rPr>
+          <w:sz w:val="22"/>
+          <w:szCs w:val="22"/>
+          <w:lang w:val="fr-FR"/>
+        </w:rPr>
+        <w:t>senté en tant que description</w:t>
+      </w:r>
+      <w:r>
+        <w:rPr>
+          <w:sz w:val="22"/>
+          <w:szCs w:val="22"/>
+          <w:lang w:val="fr-FR"/>
+        </w:rPr>
+        <w:t>)</w:t>
+      </w:r>
+      <w:r>
+        <w:rPr>
+          <w:sz w:val="22"/>
+          <w:szCs w:val="22"/>
+          <w:lang w:val="fr-FR"/>
+        </w:rPr>
+        <w:t xml:space="preserve"> ou piocher une « carte »</w:t>
+      </w:r>
+    </w:p>
+    <w:p>
+      <w:pPr>
+        <w:rPr>
+          <w:sz w:val="22"/>
+          <w:szCs w:val="22"/>
+          <w:lang w:val="fr-FR"/>
+        </w:rPr>
+      </w:pPr>
+      <w:r>
+        <w:rPr>
+          <w:sz w:val="22"/>
+          <w:szCs w:val="22"/>
+          <w:lang w:val="fr-FR"/>
+        </w:rPr>
+        <w:t>Il aura aussi le choix de faire une d</w:t>
+      </w:r>
+      <w:r>
+        <w:rPr>
+          <w:sz w:val="22"/>
+          <w:szCs w:val="22"/>
+          <w:lang w:val="fr-FR"/>
+        </w:rPr>
+        <w:t>é</w:t>
+      </w:r>
+      <w:r>
+        <w:rPr>
+          <w:sz w:val="22"/>
+          <w:szCs w:val="22"/>
+          <w:lang w:val="fr-FR"/>
+        </w:rPr>
+        <w:t>duction (créer une hypothèse)</w:t>
+      </w:r>
+    </w:p>
+    <w:p>
+      <w:pPr>
+        <w:rPr>
+          <w:lang w:val="fr-FR"/>
+        </w:rPr>
+      </w:pPr>
+    </w:p>
+    <w:p>
+      <w:pPr>
+        <w:jc w:val="both"/>
+        <w:rPr>
+          <w:b/>
+          <w:bCs/>
+          <w:sz w:val="28"/>
+          <w:szCs w:val="28"/>
+          <w:lang w:val="fr-FR"/>
+        </w:rPr>
+      </w:pPr>
+      <w:r>
+        <w:rPr>
+          <w:b/>
+          <w:bCs/>
+          <w:sz w:val="28"/>
+          <w:szCs w:val="28"/>
+          <w:lang w:val="fr-FR"/>
+        </w:rPr>
+        <w:t>Besoins Fonctionnels</w:t>
+      </w:r>
+    </w:p>
+    <w:p>
+      <w:pPr>
+        <w:rPr>
+          <w:b/>
+          <w:bCs/>
+          <w:lang w:val="fr-FR"/>
+        </w:rPr>
+      </w:pPr>
+    </w:p>
+    <w:p>
+      <w:pPr>
+        <w:rPr>
+          <w:b/>
+          <w:bCs/>
+          <w:lang w:val="fr-FR"/>
+        </w:rPr>
+      </w:pPr>
+      <w:r>
+        <w:rPr>
+          <w:b/>
+          <w:bCs/>
+          <w:lang w:val="fr-FR"/>
+        </w:rPr>
+        <w:t>ClueLau demande un jeu d'enquête type Cluedo (enquête).</w:t>
+      </w:r>
+    </w:p>
+    <w:p>
+      <w:pPr>
+        <w:rPr>
+          <w:b/>
+          <w:bCs/>
+          <w:lang w:val="fr-FR"/>
+        </w:rPr>
+      </w:pPr>
+      <w:r>
+        <w:rPr>
+          <w:lang w:val="fr-FR"/>
+        </w:rPr>
+        <w:t xml:space="preserve">- </w:t>
+      </w:r>
+      <w:r>
+        <w:rPr>
+          <w:lang w:val="fr-FR"/>
+        </w:rPr>
+        <w:t>Le jeu se joue d</w:t>
+      </w:r>
+      <w:r>
+        <w:rPr>
+          <w:lang w:val="fr-FR"/>
+        </w:rPr>
+        <w:t xml:space="preserve">ans le </w:t>
+      </w:r>
+      <w:r>
+        <w:rPr>
+          <w:b/>
+          <w:bCs/>
+          <w:lang w:val="fr-FR"/>
+        </w:rPr>
+        <w:t>terminal</w:t>
+      </w:r>
+    </w:p>
+    <w:p>
+      <w:pPr>
+        <w:rPr>
+          <w:lang w:val="fr-FR"/>
+        </w:rPr>
+      </w:pPr>
+      <w:r>
+        <w:rPr>
+          <w:lang w:val="fr-FR"/>
+        </w:rPr>
+        <w:t xml:space="preserve">- </w:t>
+      </w:r>
+      <w:r>
+        <w:rPr>
+          <w:lang w:val="fr-FR"/>
+        </w:rPr>
+        <w:t>M</w:t>
+      </w:r>
+      <w:r>
+        <w:rPr>
+          <w:lang w:val="fr-FR"/>
+        </w:rPr>
+        <w:t xml:space="preserve">écanique de </w:t>
+      </w:r>
+      <w:r>
+        <w:rPr>
+          <w:b/>
+          <w:bCs/>
+          <w:lang w:val="fr-FR"/>
+        </w:rPr>
+        <w:t>déduction</w:t>
+      </w:r>
+      <w:r>
+        <w:rPr>
+          <w:lang w:val="fr-FR"/>
+        </w:rPr>
+        <w:t xml:space="preserve"> (par preuves / détails)</w:t>
+      </w:r>
+    </w:p>
+    <w:p>
+      <w:pPr>
+        <w:rPr>
+          <w:lang w:val="fr-FR"/>
+        </w:rPr>
+      </w:pPr>
+      <w:r>
+        <w:rPr>
+          <w:lang w:val="fr-FR"/>
+        </w:rPr>
+        <w:t xml:space="preserve">- </w:t>
+      </w:r>
+      <w:r>
+        <w:rPr>
+          <w:lang w:val="fr-FR"/>
+        </w:rPr>
+        <w:t>C</w:t>
+      </w:r>
+      <w:r>
+        <w:rPr>
+          <w:lang w:val="fr-FR"/>
+        </w:rPr>
+        <w:t xml:space="preserve">ombinaison </w:t>
+      </w:r>
+      <w:r>
+        <w:rPr>
+          <w:b/>
+          <w:bCs/>
+          <w:lang w:val="fr-FR"/>
+        </w:rPr>
+        <w:t>Secrète</w:t>
+      </w:r>
+    </w:p>
+    <w:p>
+      <w:pPr>
+        <w:rPr>
+          <w:lang w:val="fr-FR"/>
+        </w:rPr>
+      </w:pPr>
+      <w:r>
+        <w:rPr>
+          <w:lang w:val="fr-FR"/>
+        </w:rPr>
+        <w:t xml:space="preserve">- </w:t>
+      </w:r>
+      <w:r>
+        <w:rPr>
+          <w:b/>
+          <w:bCs/>
+          <w:lang w:val="fr-FR"/>
+        </w:rPr>
+        <w:t>Plusieurs joueurs</w:t>
+      </w:r>
+      <w:r>
+        <w:rPr>
+          <w:lang w:val="fr-FR"/>
+        </w:rPr>
+        <w:t xml:space="preserve"> peuvent participer</w:t>
+      </w:r>
+    </w:p>
+    <w:p>
+      <w:pPr>
+        <w:rPr>
+          <w:lang w:val="fr-FR"/>
+        </w:rPr>
+      </w:pPr>
+      <w:r>
+        <w:rPr>
+          <w:lang w:val="fr-FR"/>
+        </w:rPr>
+        <w:t xml:space="preserve">- joueurs humains </w:t>
+      </w:r>
+      <w:r>
+        <w:rPr>
+          <w:b/>
+          <w:bCs/>
+          <w:lang w:val="fr-FR"/>
+        </w:rPr>
+        <w:t>et</w:t>
+      </w:r>
+      <w:r>
+        <w:rPr>
+          <w:lang w:val="fr-FR"/>
+        </w:rPr>
+        <w:t xml:space="preserve"> ordinateurs</w:t>
+      </w:r>
+    </w:p>
+    <w:p>
+      <w:pPr>
+        <w:rPr>
+          <w:lang w:val="fr-FR"/>
+        </w:rPr>
+      </w:pPr>
+      <w:r>
+        <w:rPr>
+          <w:lang w:val="fr-FR"/>
+        </w:rPr>
+        <w:t xml:space="preserve">- </w:t>
+      </w:r>
+      <w:r>
+        <w:rPr>
+          <w:b/>
+          <w:bCs/>
+          <w:lang w:val="fr-FR"/>
+        </w:rPr>
+        <w:t>deux comportements</w:t>
+      </w:r>
+      <w:r>
+        <w:rPr>
+          <w:lang w:val="fr-FR"/>
+        </w:rPr>
+        <w:t xml:space="preserve"> d'intelligence artificielle :</w:t>
+      </w:r>
+    </w:p>
+    <w:p>
+      <w:pPr>
+        <w:rPr>
+          <w:lang w:val="fr-FR"/>
+        </w:rPr>
+      </w:pPr>
+      <w:r>
+        <w:rPr>
+          <w:lang w:val="fr-FR"/>
+        </w:rPr>
+        <w:t xml:space="preserve">    -&gt; 1 comportement </w:t>
+      </w:r>
+      <w:r>
+        <w:rPr>
+          <w:b/>
+          <w:bCs/>
+          <w:lang w:val="fr-FR"/>
+        </w:rPr>
+        <w:t>naïf</w:t>
+      </w:r>
+      <w:r>
+        <w:rPr>
+          <w:lang w:val="fr-FR"/>
+        </w:rPr>
+        <w:t xml:space="preserve">, </w:t>
+      </w:r>
+      <w:r>
+        <w:rPr>
+          <w:b/>
+          <w:bCs/>
+          <w:lang w:val="fr-FR"/>
+        </w:rPr>
+        <w:t>simple</w:t>
+      </w:r>
+    </w:p>
+    <w:p>
+      <w:pPr>
+        <w:rPr>
+          <w:lang w:val="fr-FR"/>
+        </w:rPr>
+      </w:pPr>
+      <w:r>
+        <w:rPr>
+          <w:lang w:val="fr-FR"/>
+        </w:rPr>
+        <w:t xml:space="preserve">    -&gt; 1 comportement </w:t>
+      </w:r>
+      <w:r>
+        <w:rPr>
+          <w:b/>
+          <w:bCs/>
+          <w:lang w:val="fr-FR"/>
+        </w:rPr>
+        <w:t>plus évolué</w:t>
+      </w:r>
+      <w:r>
+        <w:rPr>
+          <w:lang w:val="fr-FR"/>
+        </w:rPr>
+        <w:t>, capable de tenir compte de ce qui s'est passé pendant la partie (</w:t>
+      </w:r>
+      <w:r>
+        <w:rPr>
+          <w:b/>
+          <w:bCs/>
+          <w:lang w:val="fr-FR"/>
+        </w:rPr>
+        <w:t>mémorise</w:t>
+      </w:r>
+      <w:r>
+        <w:rPr>
+          <w:lang w:val="fr-FR"/>
+        </w:rPr>
+        <w:t xml:space="preserve"> les infos utiles et adopte une stratégie </w:t>
+      </w:r>
+      <w:r>
+        <w:rPr>
+          <w:b/>
+          <w:bCs/>
+          <w:lang w:val="fr-FR"/>
+        </w:rPr>
+        <w:t>subtile</w:t>
+      </w:r>
+      <w:r>
+        <w:rPr>
+          <w:lang w:val="fr-FR"/>
+        </w:rPr>
+        <w:t xml:space="preserve"> ou m</w:t>
+      </w:r>
+      <w:r>
+        <w:rPr>
+          <w:lang w:val="fr-FR"/>
+        </w:rPr>
+        <w:t>ême</w:t>
+      </w:r>
+      <w:r>
+        <w:rPr>
+          <w:lang w:val="fr-FR"/>
+        </w:rPr>
+        <w:t xml:space="preserve"> </w:t>
+      </w:r>
+      <w:r>
+        <w:rPr>
+          <w:b/>
+          <w:bCs/>
+          <w:lang w:val="fr-FR"/>
+        </w:rPr>
+        <w:t>trompeuse</w:t>
+      </w:r>
+      <w:r>
+        <w:rPr>
+          <w:lang w:val="fr-FR"/>
+        </w:rPr>
+        <w:t>)</w:t>
+      </w:r>
+    </w:p>
+    <w:p>
+      <w:pPr>
+        <w:rPr>
+          <w:b/>
+          <w:bCs/>
+          <w:lang w:val="fr-FR"/>
+        </w:rPr>
+      </w:pPr>
+      <w:r>
+        <w:rPr>
+          <w:lang w:val="fr-FR"/>
+        </w:rPr>
+        <w:t xml:space="preserve">- codé en </w:t>
+      </w:r>
+      <w:r>
+        <w:rPr>
+          <w:b/>
+          <w:bCs/>
+          <w:lang w:val="fr-FR"/>
+        </w:rPr>
+        <w:t>c</w:t>
+      </w:r>
+    </w:p>
+    <w:p>
+      <w:pPr>
+        <w:rPr>
+          <w:lang w:val="fr-FR"/>
+        </w:rPr>
+      </w:pPr>
+      <w:r>
+        <w:rPr>
+          <w:lang w:val="fr-FR"/>
+        </w:rPr>
+        <w:t xml:space="preserve">- </w:t>
+      </w:r>
+      <w:r>
+        <w:rPr>
+          <w:lang w:val="fr-FR"/>
+        </w:rPr>
+        <w:t xml:space="preserve">application </w:t>
+      </w:r>
+      <w:r>
+        <w:rPr>
+          <w:b/>
+          <w:bCs/>
+          <w:lang w:val="fr-FR"/>
+        </w:rPr>
+        <w:t>fonctionnelle</w:t>
+      </w:r>
+    </w:p>
+    <w:p>
+      <w:pPr>
+        <w:rPr>
+          <w:lang w:val="fr-FR"/>
+        </w:rPr>
+      </w:pPr>
+    </w:p>
+    <w:p>
+      <w:pPr>
+        <w:rPr>
+          <w:b/>
+          <w:bCs/>
+          <w:sz w:val="28"/>
+          <w:szCs w:val="28"/>
+          <w:lang w:val="fr-FR"/>
+        </w:rPr>
+      </w:pPr>
+      <w:r>
+        <w:rPr>
+          <w:b/>
+          <w:bCs/>
+          <w:sz w:val="28"/>
+          <w:szCs w:val="28"/>
+          <w:lang w:val="fr-FR"/>
+        </w:rPr>
+        <w:lastRenderedPageBreak/>
         <w:t>Besoins non fonctionnels</w:t>
       </w:r>
     </w:p>

</xml_diff>

<commit_message>
Déroulement du jeu décrit (en attente de la confirmation client)
</commit_message>
<xml_diff>
--- a/Analyse de besoins.docx
+++ b/Analyse de besoins.docx
@@ -112,25 +112,7 @@
           <w:szCs w:val="22"/>
           <w:lang w:val="fr-FR"/>
         </w:rPr>
-        <w:t xml:space="preserve">tout le monde </w:t>
-      </w:r>
-      <w:proofErr w:type="gramStart"/>
-      <w:r>
-        <w:rPr>
-          <w:sz w:val="22"/>
-          <w:szCs w:val="22"/>
-          <w:lang w:val="fr-FR"/>
-        </w:rPr>
-        <w:t>est</w:t>
-      </w:r>
-      <w:proofErr w:type="gramEnd"/>
-      <w:r>
-        <w:rPr>
-          <w:sz w:val="22"/>
-          <w:szCs w:val="22"/>
-          <w:lang w:val="fr-FR"/>
-        </w:rPr>
-        <w:t xml:space="preserve"> rajouté.</w:t>
+        <w:t>tout le monde est rajouté.</w:t>
       </w:r>
     </w:p>
     <w:p>
@@ -149,87 +131,214 @@
         </w:rPr>
         <w:t>Le jeu choisit un personnage une arme et un lieu au hasard mais ne les montre pas</w:t>
       </w:r>
-    </w:p>
-    <w:p>
-      <w:pPr>
-        <w:rPr>
-          <w:sz w:val="22"/>
-          <w:szCs w:val="22"/>
-          <w:lang w:val="fr-FR"/>
-        </w:rPr>
-      </w:pPr>
-      <w:r>
-        <w:rPr>
-          <w:sz w:val="22"/>
-          <w:szCs w:val="22"/>
-          <w:lang w:val="fr-FR"/>
-        </w:rPr>
-        <w:t>Chaque tour le joueur a le choix entre se déplacer dans une autre pièce ou interagir avec l’environnement (qui lui sera pr</w:t>
-      </w:r>
-      <w:r>
-        <w:rPr>
-          <w:sz w:val="22"/>
-          <w:szCs w:val="22"/>
-          <w:lang w:val="fr-FR"/>
-        </w:rPr>
-        <w:t>é</w:t>
-      </w:r>
-      <w:r>
-        <w:rPr>
-          <w:sz w:val="22"/>
-          <w:szCs w:val="22"/>
-          <w:lang w:val="fr-FR"/>
-        </w:rPr>
-        <w:t>senté en tant que description</w:t>
-      </w:r>
-      <w:r>
-        <w:rPr>
-          <w:sz w:val="22"/>
-          <w:szCs w:val="22"/>
-          <w:lang w:val="fr-FR"/>
-        </w:rPr>
-        <w:t>)</w:t>
-      </w:r>
-      <w:r>
-        <w:rPr>
-          <w:sz w:val="22"/>
-          <w:szCs w:val="22"/>
-          <w:lang w:val="fr-FR"/>
-        </w:rPr>
-        <w:t xml:space="preserve"> ou piocher une « carte »</w:t>
-      </w:r>
-    </w:p>
-    <w:p>
-      <w:pPr>
-        <w:rPr>
-          <w:sz w:val="22"/>
-          <w:szCs w:val="22"/>
-          <w:lang w:val="fr-FR"/>
-        </w:rPr>
-      </w:pPr>
-      <w:r>
-        <w:rPr>
-          <w:sz w:val="22"/>
-          <w:szCs w:val="22"/>
-          <w:lang w:val="fr-FR"/>
-        </w:rPr>
-        <w:t>Il aura aussi le choix de faire une d</w:t>
-      </w:r>
-      <w:r>
-        <w:rPr>
-          <w:sz w:val="22"/>
-          <w:szCs w:val="22"/>
-          <w:lang w:val="fr-FR"/>
-        </w:rPr>
-        <w:t>é</w:t>
-      </w:r>
-      <w:r>
-        <w:rPr>
-          <w:sz w:val="22"/>
-          <w:szCs w:val="22"/>
-          <w:lang w:val="fr-FR"/>
-        </w:rPr>
-        <w:t>duction (créer une hypothèse)</w:t>
+      <w:r>
+        <w:rPr>
+          <w:sz w:val="22"/>
+          <w:szCs w:val="22"/>
+          <w:lang w:val="fr-FR"/>
+        </w:rPr>
+        <w:t>, puis distribue des cartes à chaque joueur, dont les noms seront visibles pendant son tour</w:t>
+      </w:r>
+    </w:p>
+    <w:p>
+      <w:pPr>
+        <w:rPr>
+          <w:sz w:val="22"/>
+          <w:szCs w:val="22"/>
+          <w:lang w:val="fr-FR"/>
+        </w:rPr>
+      </w:pPr>
+      <w:r>
+        <w:rPr>
+          <w:sz w:val="22"/>
+          <w:szCs w:val="22"/>
+          <w:lang w:val="fr-FR"/>
+        </w:rPr>
+        <w:t>Chaque tour le joueur a le choix entre se déplacer dans une autre pièce</w:t>
+      </w:r>
+    </w:p>
+    <w:p>
+      <w:pPr>
+        <w:rPr>
+          <w:sz w:val="22"/>
+          <w:szCs w:val="22"/>
+          <w:lang w:val="fr-FR"/>
+        </w:rPr>
+      </w:pPr>
+      <w:r>
+        <w:rPr>
+          <w:sz w:val="22"/>
+          <w:szCs w:val="22"/>
+          <w:lang w:val="fr-FR"/>
+        </w:rPr>
+        <w:t>-&gt; ils ont une chance sur 6 de piocher une carte par tour</w:t>
+      </w:r>
+    </w:p>
+    <w:p>
+      <w:pPr>
+        <w:rPr>
+          <w:sz w:val="22"/>
+          <w:szCs w:val="22"/>
+          <w:lang w:val="fr-FR"/>
+        </w:rPr>
+      </w:pPr>
+      <w:r>
+        <w:rPr>
+          <w:sz w:val="22"/>
+          <w:szCs w:val="22"/>
+          <w:lang w:val="fr-FR"/>
+        </w:rPr>
+        <w:t>Il aura aussi le choix de faire une</w:t>
+      </w:r>
+      <w:r>
+        <w:rPr>
+          <w:sz w:val="22"/>
+          <w:szCs w:val="22"/>
+          <w:lang w:val="fr-FR"/>
+        </w:rPr>
+        <w:t xml:space="preserve"> suggestion (</w:t>
+      </w:r>
+      <w:r>
+        <w:rPr>
+          <w:sz w:val="22"/>
+          <w:szCs w:val="22"/>
+          <w:lang w:val="fr-FR"/>
+        </w:rPr>
+        <w:t>créer une hypothèse)</w:t>
+      </w:r>
+    </w:p>
+    <w:p>
+      <w:pPr>
+        <w:rPr>
+          <w:sz w:val="22"/>
+          <w:szCs w:val="22"/>
+          <w:lang w:val="fr-FR"/>
+        </w:rPr>
+      </w:pPr>
+      <w:r>
+        <w:rPr>
+          <w:sz w:val="22"/>
+          <w:szCs w:val="22"/>
+          <w:lang w:val="fr-FR"/>
+        </w:rPr>
+        <w:t>Le jeu lui indiquera si d’autres joueurs ont une des cartes présentes dans sa suggestion</w:t>
+      </w:r>
+    </w:p>
+    <w:p>
+      <w:pPr>
+        <w:rPr>
+          <w:sz w:val="22"/>
+          <w:szCs w:val="22"/>
+          <w:lang w:val="fr-FR"/>
+        </w:rPr>
+      </w:pPr>
+      <w:r>
+        <w:rPr>
+          <w:sz w:val="22"/>
+          <w:szCs w:val="22"/>
+          <w:lang w:val="fr-FR"/>
+        </w:rPr>
+        <w:t xml:space="preserve"> -&gt; Chacun leur tour bien sûr comme dans le vrai</w:t>
+      </w:r>
+    </w:p>
+    <w:p>
+      <w:pPr>
+        <w:rPr>
+          <w:sz w:val="22"/>
+          <w:szCs w:val="22"/>
+          <w:lang w:val="fr-FR"/>
+        </w:rPr>
+      </w:pPr>
+      <w:r>
+        <w:rPr>
+          <w:sz w:val="22"/>
+          <w:szCs w:val="22"/>
+          <w:lang w:val="fr-FR"/>
+        </w:rPr>
+        <w:t xml:space="preserve">Pendant le tour des </w:t>
+      </w:r>
+      <w:r>
+        <w:rPr>
+          <w:sz w:val="22"/>
+          <w:szCs w:val="22"/>
+          <w:lang w:val="fr-FR"/>
+        </w:rPr>
+        <w:t>IA</w:t>
+      </w:r>
+      <w:r>
+        <w:rPr>
+          <w:sz w:val="22"/>
+          <w:szCs w:val="22"/>
+          <w:lang w:val="fr-FR"/>
+        </w:rPr>
+        <w:t xml:space="preserve"> des phrases s’afficheront qui indiqueront leurs actions</w:t>
+      </w:r>
+      <w:r>
+        <w:rPr>
+          <w:sz w:val="22"/>
+          <w:szCs w:val="22"/>
+          <w:lang w:val="fr-FR"/>
+        </w:rPr>
+        <w:t xml:space="preserve"> (avec des temps entre les actions au hasard pour fausser une réflexion)</w:t>
+      </w:r>
+    </w:p>
+    <w:p>
+      <w:pPr>
+        <w:rPr>
+          <w:sz w:val="22"/>
+          <w:szCs w:val="22"/>
+          <w:lang w:val="fr-FR"/>
+        </w:rPr>
+      </w:pPr>
+      <w:r>
+        <w:rPr>
+          <w:sz w:val="22"/>
+          <w:szCs w:val="22"/>
+          <w:lang w:val="fr-FR"/>
+        </w:rPr>
+        <w:t>Les joueurs ont le choix de faire une accusation (une fois par partie)</w:t>
+      </w:r>
+      <w:r>
+        <w:rPr>
+          <w:sz w:val="22"/>
+          <w:szCs w:val="22"/>
+          <w:lang w:val="fr-FR"/>
+        </w:rPr>
+        <w:t xml:space="preserve"> en écrivant les initiaux des 3 cartes (le fameux code)</w:t>
+      </w:r>
+    </w:p>
+    <w:p>
+      <w:pPr>
+        <w:rPr>
+          <w:sz w:val="22"/>
+          <w:szCs w:val="22"/>
+          <w:lang w:val="fr-FR"/>
+        </w:rPr>
+      </w:pPr>
+      <w:r>
+        <w:rPr>
+          <w:sz w:val="22"/>
+          <w:szCs w:val="22"/>
+          <w:lang w:val="fr-FR"/>
+        </w:rPr>
+        <w:t xml:space="preserve"> -&gt; si c’est juste il a gagné</w:t>
+      </w:r>
+    </w:p>
+    <w:p>
+      <w:pPr>
+        <w:rPr>
+          <w:sz w:val="22"/>
+          <w:szCs w:val="22"/>
+          <w:lang w:val="fr-FR"/>
+        </w:rPr>
+      </w:pPr>
+      <w:r>
+        <w:rPr>
+          <w:sz w:val="22"/>
+          <w:szCs w:val="22"/>
+          <w:lang w:val="fr-FR"/>
+        </w:rPr>
+        <w:t xml:space="preserve"> -&gt; si c’est faux il a perdu et les autres joueurs seront invités à regarder ses cartes qui seront affichées pendant 10 secondes sur l’écran et sera rajouté dans le répertoire des connaissances des IA</w:t>
       </w:r>
     </w:p>
     <w:p>
@@ -404,6 +513,7 @@
         <w:rPr>
           <w:lang w:val="fr-FR"/>
         </w:rPr>
+        <w:lastRenderedPageBreak/>
         <w:t xml:space="preserve">- </w:t>
       </w:r>
       <w:r>
@@ -666,7 +776,6 @@
           <w:szCs w:val="28"/>
           <w:lang w:val="fr-FR"/>
         </w:rPr>
-        <w:lastRenderedPageBreak/>
         <w:t>Besoins non fonctionnels</w:t>
       </w:r>
     </w:p>

</xml_diff>